<commit_message>
Update technical report: 0.50m/-1g specs, attitude gains, RC mode results
- 직경 0.58m→0.50m, 체적 0.35→0.262m³, 질량 370→279g 반영
- 음성부력 -1g (fail-safe), Cd 0.04→0.30 반영
- 확정 자세제어기 게인 테이블 추가
- RC 모드 검증 결과 추가 (Manual/Stabilized/Deadband/RC_Valid)
- Roll 1~3deg 물리적 한계 명시

Co-Authored-By: Claude Opus 4.6 (1M context) <noreply@anthropic.com>
</commit_message>
<xml_diff>
--- a/돌고래_헬륨_드론_기술분석_보고서.docx
+++ b/돌고래_헬륨_드론_기술분석_보고서.docx
@@ -1162,7 +1162,7 @@
               <w:rPr>
                 <w:sz w:val="18"/>
               </w:rPr>
-              <w:t>약 0.5m</w:t>
+              <w:t>약 0.50m</w:t>
             </w:r>
           </w:p>
         </w:tc>
@@ -1175,7 +1175,7 @@
               <w:rPr>
                 <w:sz w:val="18"/>
               </w:rPr>
-              <w:t>길이:직경 ≈ 4:1</w:t>
+              <w:t>Fineness Ratio 4:1</w:t>
             </w:r>
           </w:p>
         </w:tc>
@@ -1203,7 +1203,7 @@
               <w:rPr>
                 <w:sz w:val="18"/>
               </w:rPr>
-              <w:t>약 0.35m³ (350L)</w:t>
+              <w:t>약 0.262m³ (262L)</w:t>
             </w:r>
           </w:p>
         </w:tc>
@@ -1216,7 +1216,7 @@
               <w:rPr>
                 <w:sz w:val="18"/>
               </w:rPr>
-              <w:t>타원체 근사</w:t>
+              <w:t>Prolate spheroid 공식</w:t>
             </w:r>
           </w:p>
         </w:tc>
@@ -1244,7 +1244,7 @@
               <w:rPr>
                 <w:sz w:val="18"/>
               </w:rPr>
-              <w:t>약 364g</w:t>
+              <w:t>약 278g</w:t>
             </w:r>
           </w:p>
         </w:tc>
@@ -1257,7 +1257,7 @@
               <w:rPr>
                 <w:sz w:val="18"/>
               </w:rPr>
-              <w:t>350L × 1.04g/L</w:t>
+              <w:t>262L × 1.06g/L</w:t>
             </w:r>
           </w:p>
         </w:tc>
@@ -1285,7 +1285,7 @@
               <w:rPr>
                 <w:sz w:val="18"/>
               </w:rPr>
-              <w:t>약 80~120g</w:t>
+              <w:t>약 65~80g</w:t>
             </w:r>
           </w:p>
         </w:tc>
@@ -1298,7 +1298,7 @@
               <w:rPr>
                 <w:sz w:val="18"/>
               </w:rPr>
-              <w:t>Mylar 20μm 기준</w:t>
+              <w:t>Mylar 20μm, 표면적 ~2.5m²</w:t>
             </w:r>
           </w:p>
         </w:tc>
@@ -1326,7 +1326,7 @@
               <w:rPr>
                 <w:sz w:val="18"/>
               </w:rPr>
-              <w:t>약 240~280g</w:t>
+              <w:t>약 198~213g</w:t>
             </w:r>
           </w:p>
         </w:tc>
@@ -1436,7 +1436,7 @@
               <w:rPr>
                 <w:sz w:val="18"/>
               </w:rPr>
-              <w:t>잔여 여유분</w:t>
+              <w:t>밸러스트/트림</w:t>
             </w:r>
           </w:p>
         </w:tc>
@@ -1449,7 +1449,7 @@
               <w:rPr>
                 <w:sz w:val="18"/>
               </w:rPr>
-              <w:t>약 160~235g</w:t>
+              <w:t>약 10~15g</w:t>
             </w:r>
           </w:p>
         </w:tc>
@@ -1462,7 +1462,7 @@
               <w:rPr>
                 <w:sz w:val="18"/>
               </w:rPr>
-              <w:t>밸러스트/추가장비용</w:t>
+              <w:t>CG 조절 + 음성부력 -1g</w:t>
             </w:r>
           </w:p>
         </w:tc>
@@ -7612,7 +7612,7 @@
     </w:p>
     <w:p>
       <w:r>
-        <w:t xml:space="preserve">      Cd ≈ 0.04 (돌고래 유선형)</w:t>
+        <w:t xml:space="preserve">      Cd ≈ 0.30 (엔벨로프+지느러미 등가 항력계수)</w:t>
       </w:r>
     </w:p>
     <w:p/>
@@ -7645,12 +7645,12 @@
     </w:p>
     <w:p>
       <w:r>
-        <w:t xml:space="preserve">  params.m = 0.50;           % 총 질량 [kg]</w:t>
-      </w:r>
-    </w:p>
-    <w:p>
-      <w:r>
-        <w:t xml:space="preserve">  params.V_envelope = 0.35;   % 엔벨로프 체적 [m³]</w:t>
+        <w:t xml:space="preserve">  params.m = 0.279;          % 총 질량 [kg] (음성부력 -1g)</w:t>
+      </w:r>
+    </w:p>
+    <w:p>
+      <w:r>
+        <w:t xml:space="preserve">  params.V_envelope = 0.262;  % 엔벨로프 체적 [m³]</w:t>
       </w:r>
     </w:p>
     <w:p>
@@ -8296,6 +8296,395 @@
     <w:p>
       <w:r>
         <w:t xml:space="preserve">  • 또는 확정된 PID 게인을 C++ 코드에 수동 포팅</w:t>
+      </w:r>
+    </w:p>
+    <w:p/>
+    <w:p>
+      <w:r>
+        <w:t>■ 확정된 자세 제어기 게인 (Simulink 검증 완료)</w:t>
+      </w:r>
+    </w:p>
+    <w:tbl>
+      <w:tblPr>
+        <w:tblStyle w:val="LightGrid-Accent1"/>
+        <w:tblW w:type="auto" w:w="0"/>
+        <w:jc w:val="center"/>
+        <w:tblLook w:firstColumn="1" w:firstRow="1" w:lastColumn="0" w:lastRow="0" w:noHBand="0" w:noVBand="1" w:val="04A0"/>
+      </w:tblPr>
+      <w:tblGrid>
+        <w:gridCol w:w="1440"/>
+        <w:gridCol w:w="1440"/>
+        <w:gridCol w:w="1440"/>
+        <w:gridCol w:w="1440"/>
+        <w:gridCol w:w="1440"/>
+        <w:gridCol w:w="1440"/>
+      </w:tblGrid>
+      <w:tr>
+        <w:tc>
+          <w:tcPr>
+            <w:tcW w:type="dxa" w:w="1440"/>
+          </w:tcPr>
+          <w:p>
+            <w:r>
+              <w:rPr>
+                <w:b/>
+                <w:sz w:val="18"/>
+              </w:rPr>
+              <w:t>축</w:t>
+            </w:r>
+          </w:p>
+        </w:tc>
+        <w:tc>
+          <w:tcPr>
+            <w:tcW w:type="dxa" w:w="1440"/>
+          </w:tcPr>
+          <w:p>
+            <w:r>
+              <w:rPr>
+                <w:b/>
+                <w:sz w:val="18"/>
+              </w:rPr>
+              <w:t>Outer P</w:t>
+            </w:r>
+          </w:p>
+        </w:tc>
+        <w:tc>
+          <w:tcPr>
+            <w:tcW w:type="dxa" w:w="1440"/>
+          </w:tcPr>
+          <w:p>
+            <w:r>
+              <w:rPr>
+                <w:b/>
+                <w:sz w:val="18"/>
+              </w:rPr>
+              <w:t>Inner P</w:t>
+            </w:r>
+          </w:p>
+        </w:tc>
+        <w:tc>
+          <w:tcPr>
+            <w:tcW w:type="dxa" w:w="1440"/>
+          </w:tcPr>
+          <w:p>
+            <w:r>
+              <w:rPr>
+                <w:b/>
+                <w:sz w:val="18"/>
+              </w:rPr>
+              <w:t>Inner I</w:t>
+            </w:r>
+          </w:p>
+        </w:tc>
+        <w:tc>
+          <w:tcPr>
+            <w:tcW w:type="dxa" w:w="1440"/>
+          </w:tcPr>
+          <w:p>
+            <w:r>
+              <w:rPr>
+                <w:b/>
+                <w:sz w:val="18"/>
+              </w:rPr>
+              <w:t>Inner D</w:t>
+            </w:r>
+          </w:p>
+        </w:tc>
+        <w:tc>
+          <w:tcPr>
+            <w:tcW w:type="dxa" w:w="1440"/>
+          </w:tcPr>
+          <w:p>
+            <w:r>
+              <w:rPr>
+                <w:b/>
+                <w:sz w:val="18"/>
+              </w:rPr>
+              <w:t>비고</w:t>
+            </w:r>
+          </w:p>
+        </w:tc>
+      </w:tr>
+      <w:tr>
+        <w:tc>
+          <w:tcPr>
+            <w:tcW w:type="dxa" w:w="1440"/>
+          </w:tcPr>
+          <w:p>
+            <w:r>
+              <w:rPr>
+                <w:sz w:val="18"/>
+              </w:rPr>
+              <w:t>Roll (p)</w:t>
+            </w:r>
+          </w:p>
+        </w:tc>
+        <w:tc>
+          <w:tcPr>
+            <w:tcW w:type="dxa" w:w="1440"/>
+          </w:tcPr>
+          <w:p>
+            <w:r>
+              <w:rPr>
+                <w:sz w:val="18"/>
+              </w:rPr>
+              <w:t>1.4</w:t>
+            </w:r>
+          </w:p>
+        </w:tc>
+        <w:tc>
+          <w:tcPr>
+            <w:tcW w:type="dxa" w:w="1440"/>
+          </w:tcPr>
+          <w:p>
+            <w:r>
+              <w:rPr>
+                <w:sz w:val="18"/>
+              </w:rPr>
+              <w:t>0.30</w:t>
+            </w:r>
+          </w:p>
+        </w:tc>
+        <w:tc>
+          <w:tcPr>
+            <w:tcW w:type="dxa" w:w="1440"/>
+          </w:tcPr>
+          <w:p>
+            <w:r>
+              <w:rPr>
+                <w:sz w:val="18"/>
+              </w:rPr>
+              <w:t>0.01</w:t>
+            </w:r>
+          </w:p>
+        </w:tc>
+        <w:tc>
+          <w:tcPr>
+            <w:tcW w:type="dxa" w:w="1440"/>
+          </w:tcPr>
+          <w:p>
+            <w:r>
+              <w:rPr>
+                <w:sz w:val="18"/>
+              </w:rPr>
+              <w:t>0.10</w:t>
+            </w:r>
+          </w:p>
+        </w:tc>
+        <w:tc>
+          <w:tcPr>
+            <w:tcW w:type="dxa" w:w="1440"/>
+          </w:tcPr>
+          <w:p>
+            <w:r>
+              <w:rPr>
+                <w:sz w:val="18"/>
+              </w:rPr>
+              <w:t>Roll 1~3deg가 물리적 한계</w:t>
+            </w:r>
+          </w:p>
+        </w:tc>
+      </w:tr>
+      <w:tr>
+        <w:tc>
+          <w:tcPr>
+            <w:tcW w:type="dxa" w:w="1440"/>
+          </w:tcPr>
+          <w:p>
+            <w:r>
+              <w:rPr>
+                <w:sz w:val="18"/>
+              </w:rPr>
+              <w:t>Pitch (q)</w:t>
+            </w:r>
+          </w:p>
+        </w:tc>
+        <w:tc>
+          <w:tcPr>
+            <w:tcW w:type="dxa" w:w="1440"/>
+          </w:tcPr>
+          <w:p>
+            <w:r>
+              <w:rPr>
+                <w:sz w:val="18"/>
+              </w:rPr>
+              <w:t>0.25</w:t>
+            </w:r>
+          </w:p>
+        </w:tc>
+        <w:tc>
+          <w:tcPr>
+            <w:tcW w:type="dxa" w:w="1440"/>
+          </w:tcPr>
+          <w:p>
+            <w:r>
+              <w:rPr>
+                <w:sz w:val="18"/>
+              </w:rPr>
+              <w:t>0.20</w:t>
+            </w:r>
+          </w:p>
+        </w:tc>
+        <w:tc>
+          <w:tcPr>
+            <w:tcW w:type="dxa" w:w="1440"/>
+          </w:tcPr>
+          <w:p>
+            <w:r>
+              <w:rPr>
+                <w:sz w:val="18"/>
+              </w:rPr>
+              <w:t>0.00</w:t>
+            </w:r>
+          </w:p>
+        </w:tc>
+        <w:tc>
+          <w:tcPr>
+            <w:tcW w:type="dxa" w:w="1440"/>
+          </w:tcPr>
+          <w:p>
+            <w:r>
+              <w:rPr>
+                <w:sz w:val="18"/>
+              </w:rPr>
+              <w:t>0.02</w:t>
+            </w:r>
+          </w:p>
+        </w:tc>
+        <w:tc>
+          <w:tcPr>
+            <w:tcW w:type="dxa" w:w="1440"/>
+          </w:tcPr>
+          <w:p>
+            <w:r>
+              <w:rPr>
+                <w:sz w:val="18"/>
+              </w:rPr>
+              <w:t>꼬리 추진 커플링으로 ±2deg 진동(감쇠)</w:t>
+            </w:r>
+          </w:p>
+        </w:tc>
+      </w:tr>
+      <w:tr>
+        <w:tc>
+          <w:tcPr>
+            <w:tcW w:type="dxa" w:w="1440"/>
+          </w:tcPr>
+          <w:p>
+            <w:r>
+              <w:rPr>
+                <w:sz w:val="18"/>
+              </w:rPr>
+              <w:t>Yaw (r)</w:t>
+            </w:r>
+          </w:p>
+        </w:tc>
+        <w:tc>
+          <w:tcPr>
+            <w:tcW w:type="dxa" w:w="1440"/>
+          </w:tcPr>
+          <w:p>
+            <w:r>
+              <w:rPr>
+                <w:sz w:val="18"/>
+              </w:rPr>
+              <w:t>1.0</w:t>
+            </w:r>
+          </w:p>
+        </w:tc>
+        <w:tc>
+          <w:tcPr>
+            <w:tcW w:type="dxa" w:w="1440"/>
+          </w:tcPr>
+          <w:p>
+            <w:r>
+              <w:rPr>
+                <w:sz w:val="18"/>
+              </w:rPr>
+              <w:t>0.20</w:t>
+            </w:r>
+          </w:p>
+        </w:tc>
+        <w:tc>
+          <w:tcPr>
+            <w:tcW w:type="dxa" w:w="1440"/>
+          </w:tcPr>
+          <w:p>
+            <w:r>
+              <w:rPr>
+                <w:sz w:val="18"/>
+              </w:rPr>
+              <w:t>0.02</w:t>
+            </w:r>
+          </w:p>
+        </w:tc>
+        <w:tc>
+          <w:tcPr>
+            <w:tcW w:type="dxa" w:w="1440"/>
+          </w:tcPr>
+          <w:p>
+            <w:r>
+              <w:rPr>
+                <w:sz w:val="18"/>
+              </w:rPr>
+              <w:t>0.03</w:t>
+            </w:r>
+          </w:p>
+        </w:tc>
+        <w:tc>
+          <w:tcPr>
+            <w:tcW w:type="dxa" w:w="1440"/>
+          </w:tcPr>
+          <w:p>
+            <w:r>
+              <w:rPr>
+                <w:sz w:val="18"/>
+              </w:rPr>
+              <w:t>Yaw가 주 조향축</w:t>
+            </w:r>
+          </w:p>
+        </w:tc>
+      </w:tr>
+    </w:tbl>
+    <w:p/>
+    <w:p>
+      <w:r>
+        <w:t>■ RC 모드 검증 결과</w:t>
+      </w:r>
+    </w:p>
+    <w:p>
+      <w:r>
+        <w:t xml:space="preserve">  • Manual Direct: RC 스틱 → 서보 직접 제어 (PID 우회)</w:t>
+      </w:r>
+    </w:p>
+    <w:p>
+      <w:r>
+        <w:t xml:space="preserve">  • Stabilized: RC 스틱 → 자세 PID 보조</w:t>
+      </w:r>
+    </w:p>
+    <w:p>
+      <w:r>
+        <w:t xml:space="preserve">  • Mode Switch: CH5 &gt;= 0.5 → Stabilized, 아니면 Manual</w:t>
+      </w:r>
+    </w:p>
+    <w:p>
+      <w:r>
+        <w:t xml:space="preserve">  • Deadband ±0.05, RC_Valid failsafe, Servo dynamics 포함</w:t>
+      </w:r>
+    </w:p>
+    <w:p>
+      <w:r>
+        <w:t xml:space="preserve">  • 부력 설정: 음성부력 -1g (fail-safe 자연 착륙)</w:t>
+      </w:r>
+    </w:p>
+    <w:p>
+      <w:r>
+        <w:t xml:space="preserve">  • Roll 물리적 한계: 1~3deg (CB-CG 펜듈럼 복원 &gt; 지느러미 토크)</w:t>
+      </w:r>
+    </w:p>
+    <w:p>
+      <w:r>
+        <w:t xml:space="preserve">  • 조종 방식: Yaw(꼬리)로 방향전환, Roll은 미세 보조</w:t>
       </w:r>
     </w:p>
     <w:p/>
@@ -9057,7 +9446,7 @@
               <w:rPr>
                 <w:sz w:val="18"/>
               </w:rPr>
-              <w:t>약 0.5m</w:t>
+              <w:t>약 0.50m</w:t>
             </w:r>
           </w:p>
         </w:tc>
@@ -9098,7 +9487,7 @@
               <w:rPr>
                 <w:sz w:val="18"/>
               </w:rPr>
-              <w:t>약 350L (0.35m³)</w:t>
+              <w:t>약 262L (0.262m³)</w:t>
             </w:r>
           </w:p>
         </w:tc>
@@ -9111,7 +9500,7 @@
               <w:rPr>
                 <w:sz w:val="18"/>
               </w:rPr>
-              <w:t>타원체 근사</w:t>
+              <w:t>Prolate spheroid</w:t>
             </w:r>
           </w:p>
         </w:tc>
@@ -9139,7 +9528,7 @@
               <w:rPr>
                 <w:sz w:val="18"/>
               </w:rPr>
-              <w:t>약 364g</w:t>
+              <w:t>약 278g</w:t>
             </w:r>
           </w:p>
         </w:tc>
@@ -9179,7 +9568,7 @@
               <w:rPr>
                 <w:sz w:val="18"/>
               </w:rPr>
-              <w:t>약 150~200g</w:t>
+              <w:t>약 279g</w:t>
             </w:r>
           </w:p>
         </w:tc>
@@ -9192,7 +9581,7 @@
               <w:rPr>
                 <w:sz w:val="18"/>
               </w:rPr>
-              <w:t>엔벨로프 + 전자부 + 구동부</w:t>
+              <w:t>부력+1g 음성부력</w:t>
             </w:r>
           </w:p>
         </w:tc>
@@ -9207,7 +9596,7 @@
               <w:rPr>
                 <w:sz w:val="18"/>
               </w:rPr>
-              <w:t>탑재 여유분</w:t>
+              <w:t>부력 설정</w:t>
             </w:r>
           </w:p>
         </w:tc>
@@ -9220,7 +9609,7 @@
               <w:rPr>
                 <w:sz w:val="18"/>
               </w:rPr>
-              <w:t>약 160~210g</w:t>
+              <w:t>음성부력 -1g</w:t>
             </w:r>
           </w:p>
         </w:tc>
@@ -9233,7 +9622,7 @@
               <w:rPr>
                 <w:sz w:val="18"/>
               </w:rPr>
-              <w:t>LED, 밸러스트 등</w:t>
+              <w:t>fail-safe 자연 착륙</w:t>
             </w:r>
           </w:p>
         </w:tc>

</xml_diff>